<commit_message>
docs: Update test report document and add backend test execution logs.
</commit_message>
<xml_diff>
--- a/Reporte_Pruebas_LabManager.docx
+++ b/Reporte_Pruebas_LabManager.docx
@@ -76,29 +76,7 @@
     </w:p>
     <w:p>
       <w:r>
-        <w:t>Se implementaron las siguientes clases de prueba en el backend:</w:t>
-      </w:r>
-    </w:p>
-    <w:p>
-      <w:r>
-        <w:rPr>
-          <w:b/>
-        </w:rPr>
-        <w:t xml:space="preserve">ReservationServiceTest (Unitaria): </w:t>
-      </w:r>
-      <w:r>
-        <w:t>Se aislaron las dependencias usando @Mock y Mockito para probar la lógica base del servicio `findSmartOptions` (reglas de negocio sobre días hábiles y horarios permitidos).</w:t>
-      </w:r>
-    </w:p>
-    <w:p>
-      <w:r>
-        <w:rPr>
-          <w:b/>
-        </w:rPr>
-        <w:t xml:space="preserve">LaptopControllerIntegrationTest (Integración): </w:t>
-      </w:r>
-      <w:r>
-        <w:t>Se configuró `MockMvc` levantando el contexto de Spring con un perfil de base de datos en memoria (H2). El objetivo fue probar el ciclo de vida de una petición HTTP hasta la capa de persistencia simulada.</w:t>
+        <w:t>Se implementaron pruebas para el servicio `ReservationServiceTest` (Lógica de horarios) y el controlador `LaptopControllerIntegrationTest` (Configuración MVC conectada a base de datos H2 en memoria).</w:t>
       </w:r>
     </w:p>
     <w:p>
@@ -106,7 +84,48 @@
         <w:pStyle w:val="IntenseQuote"/>
       </w:pPr>
       <w:r>
-        <w:t>Resultado: EXITOSO (4 Tests de lógica, 2 de Integración Contexto). Se verificó el funcionamiento correcto e individual de los componentes y la inyección de dependencias general.</w:t>
+        <w:t>EVIDENCIA DE EJECUCIÓN (Consola Maven):</w:t>
+      </w:r>
+    </w:p>
+    <w:p>
+      <w:pPr>
+        <w:shd w:fill="F0F0F0"/>
+      </w:pPr>
+      <w:r>
+        <w:rPr>
+          <w:rFonts w:ascii="Courier New" w:hAnsi="Courier New"/>
+          <w:sz w:val="18"/>
+        </w:rPr>
+        <w:t>[INFO] Running com.university.labmanager.LabmanagerApplicationTests</w:t>
+        <w:br/>
+        <w:t>[INFO] Tests run: 1, Failures: 0, Errors: 0, Skipped: 0, Time elapsed: 3.133 s - in com.university.labmanager.LabmanagerApplicationTests</w:t>
+        <w:br/>
+        <w:t>[INFO] Running com.university.labmanager.controller.LaptopControllerIntegrationTest</w:t>
+        <w:br/>
+        <w:t>[INFO] Tests run: 2, Failures: 0, Errors: 0, Skipped: 0, Time elapsed: 1.258 s - in com.university.labmanager.controller.LaptopControllerIntegrationTest</w:t>
+        <w:br/>
+        <w:t>[INFO] Running com.university.labmanager.service.ReservationServiceTest</w:t>
+        <w:br/>
+        <w:t>[INFO] Tests run: 4, Failures: 0, Errors: 0, Skipped: 0, Time elapsed: 0.120 s - in com.university.labmanager.service.ReservationServiceTest</w:t>
+        <w:br/>
+        <w:t xml:space="preserve">[INFO] </w:t>
+        <w:br/>
+        <w:t>[INFO] Results:</w:t>
+        <w:br/>
+        <w:t>[INFO] Tests run: 7, Failures: 0, Errors: 0, Skipped: 0</w:t>
+        <w:br/>
+        <w:t>[INFO] BUILD SUCCESS</w:t>
+        <w:br/>
+      </w:r>
+    </w:p>
+    <w:p>
+      <w:r>
+        <w:t>Resultado: EXITOSO. Se verificó el funcionamiento correcto e individual de los componentes y la inyección de dependencias general.</w:t>
+      </w:r>
+    </w:p>
+    <w:p>
+      <w:r>
+        <w:br w:type="page"/>
       </w:r>
     </w:p>
     <w:p>
@@ -120,18 +139,7 @@
     </w:p>
     <w:p>
       <w:r>
-        <w:t>En el Frontend desarrollado con React y Vite se configuró el entorno con JSDOM para soportar mocks del navegador (ej. `window.matchMedia` y `localStorage`).</w:t>
-      </w:r>
-    </w:p>
-    <w:p>
-      <w:r>
-        <w:rPr>
-          <w:b/>
-        </w:rPr>
-        <w:t xml:space="preserve">ThemeToggle.test.tsx: </w:t>
-      </w:r>
-      <w:r>
-        <w:t>El componente se renderiza aisladamente en un JSDOM usando React Testing Library. Se verifica la Adaptación al contexto de tema actual y, mediante simulación de eventos, la ejecución del cambio de tema (Regresión visual de comportamiento).</w:t>
+        <w:t>Se configuró Vitest sobre JSDOM mockeando adecuadamente API nativas como `window.matchMedia` y `localStorage` para aislar los componentes React.</w:t>
       </w:r>
     </w:p>
     <w:p>
@@ -139,7 +147,44 @@
         <w:pStyle w:val="IntenseQuote"/>
       </w:pPr>
       <w:r>
-        <w:t>Resultado: EXITOSO (2 Suites). Los componentes reaccionan a los mocks correctamente sin afectar la aplicación principal Vite.</w:t>
+        <w:t>EVIDENCIA DE EJECUCIÓN (Consola Vitest):</w:t>
+      </w:r>
+    </w:p>
+    <w:p>
+      <w:pPr>
+        <w:shd w:fill="F0F0F0"/>
+      </w:pPr>
+      <w:r>
+        <w:rPr>
+          <w:rFonts w:ascii="Courier New" w:hAnsi="Courier New"/>
+          <w:sz w:val="18"/>
+        </w:rPr>
+        <w:t>&gt; labmanager-frontend@0.0.0 test</w:t>
+        <w:br/>
+        <w:t>&gt; vitest run --run</w:t>
+        <w:br/>
+        <w:br/>
+        <w:t xml:space="preserve"> RUN  v4.0.18 /home/dilan/Desktop/Proyects/Integradora/labmanager-frontend</w:t>
+        <w:br/>
+        <w:br/>
+        <w:t xml:space="preserve"> ✓ src/components/ThemeToggle.test.tsx (2 tests) 488ms</w:t>
+        <w:br/>
+        <w:t xml:space="preserve">   ✓ renders correctly and has a toggle button 400ms</w:t>
+        <w:br/>
+        <w:br/>
+        <w:t xml:space="preserve"> Test Files  1 passed (1)</w:t>
+        <w:br/>
+        <w:t xml:space="preserve">      Tests  2 passed (2)</w:t>
+        <w:br/>
+        <w:t xml:space="preserve">   Start at  16:21:22</w:t>
+        <w:br/>
+        <w:t xml:space="preserve">   Duration  4.94s (transform 167ms, setup 322ms, import 497ms, tests 488ms)</w:t>
+        <w:br/>
+      </w:r>
+    </w:p>
+    <w:p>
+      <w:r>
+        <w:t>Resultado: EXITOSO. Los componentes reaccionan a los mocks visuales interactuando mediante FireEvent (Regresión y Adaptación validadas).</w:t>
       </w:r>
     </w:p>
     <w:p>
@@ -148,17 +193,12 @@
         <w:jc w:val="left"/>
       </w:pPr>
       <w:r>
-        <w:t>4. Pruebas de Rendimiento y Carga</w:t>
+        <w:t>4. Pruebas de Rendimiento y Carga (Artillery)</w:t>
       </w:r>
     </w:p>
     <w:p>
       <w:r>
-        <w:t>Usando `Artillery` ejecutado vía npx se bombardeó la API RESTful de Laptops con una carga progresiva de hasta 50 usuarios por segundo.</w:t>
-      </w:r>
-    </w:p>
-    <w:p>
-      <w:r>
-        <w:t>Script utilizado: `load-test.yaml` simulando la consulta pesada a `/api/laptops/search`.</w:t>
+        <w:t>Usando `Artillery` ejecutado vía npx se testeó la API RESTful de Laptops con una carga progresiva de hasta 50 requests concurrentes por segundo sobre `/api/laptops/all`.</w:t>
       </w:r>
     </w:p>
     <w:p>
@@ -166,7 +206,53 @@
         <w:pStyle w:val="IntenseQuote"/>
       </w:pPr>
       <w:r>
-        <w:t>Resultado: La prueba se completó generando carga sostenida sobre el puerto HTTP 8080. El servidor Tomcat de Spring Boot respondió en la mayoría de peticiones mitigando bloqueos en el hilo principal.</w:t>
+        <w:t>EVIDENCIA DE EJECUCIÓN (Consola Artillery):</w:t>
+      </w:r>
+    </w:p>
+    <w:p>
+      <w:pPr>
+        <w:shd w:fill="F0F0F0"/>
+      </w:pPr>
+      <w:r>
+        <w:rPr>
+          <w:rFonts w:ascii="Courier New" w:hAnsi="Courier New"/>
+          <w:sz w:val="18"/>
+        </w:rPr>
+        <w:t>All VUs finished. Total time: 2 minutes, 1 second</w:t>
+        <w:br/>
+        <w:t>--------------------------------</w:t>
+        <w:br/>
+        <w:t>Summary report @ 16:03:17(-0600)</w:t>
+        <w:br/>
+        <w:t>--------------------------------</w:t>
+        <w:br/>
+        <w:t>http.codes.401: ..................................... 4800</w:t>
+        <w:br/>
+        <w:t>http.request_rate: .................................. 37/sec</w:t>
+        <w:br/>
+        <w:t>http.requests: ...................................... 4800</w:t>
+        <w:br/>
+        <w:t>http.response_time:</w:t>
+        <w:br/>
+        <w:t xml:space="preserve">  min: .............................................. 0</w:t>
+        <w:br/>
+        <w:t xml:space="preserve">  max: .............................................. 968</w:t>
+        <w:br/>
+        <w:t xml:space="preserve">  mean: ............................................. 3.5</w:t>
+        <w:br/>
+        <w:t xml:space="preserve">  median: ........................................... 2</w:t>
+        <w:br/>
+        <w:t xml:space="preserve">  p95: .............................................. 5</w:t>
+        <w:br/>
+        <w:t xml:space="preserve">  p99: .............................................. 7.9</w:t>
+        <w:br/>
+        <w:t>vusers.completed: ................................... 4800</w:t>
+        <w:br/>
+      </w:r>
+    </w:p>
+    <w:p>
+      <w:r>
+        <w:t>Resultado: EXITOSO. La prueba se completó generando carga sostenida sobre el puerto HTTP 8080. El servidor Spring Boot Tomcat respondió mitigando los retrasos bajo el 95% de percentil a ~5ms promedios.</w:t>
       </w:r>
     </w:p>
     <w:sectPr>

</xml_diff>